<commit_message>
Remove hardcoded Azure key
</commit_message>
<xml_diff>
--- a/VOC_Categorisation_API_Documentation.docx
+++ b/VOC_Categorisation_API_Documentation.docx
@@ -487,6 +487,53 @@
       </w:r>
       <w:r>
         <w:t>/data.xlsx"</w:t>
+      </w:r>
+      <w:r>
+        <w:br/>
+        <w:t>}'</w:t>
+      </w:r>
+    </w:p>
+    <w:p>
+      <w:r>
+        <w:t>curl --location '</w:t>
+      </w:r>
+      <w:hyperlink r:id="rId8" w:tgtFrame="_blank" w:tooltip="https://pfl-aiml-prod.azurewebsites.net/api/vocc%27" w:history="1">
+        <w:r>
+          <w:rPr>
+            <w:rStyle w:val="Hyperlink"/>
+          </w:rPr>
+          <w:t>https://pfl-aiml-prod.azurewebsites.net/api/vocc'</w:t>
+        </w:r>
+      </w:hyperlink>
+      <w:r>
+        <w:t xml:space="preserve"> \</w:t>
+      </w:r>
+      <w:r>
+        <w:br/>
+        <w:t>--header 'x-functions-key: jboWU0zNUbEAkN0kt68HN3IBlmvCr47BulcTFN-oXMrKAzFu0YZC0w==' \</w:t>
+      </w:r>
+      <w:r>
+        <w:br/>
+        <w:t>--header 'Content-Type: application/</w:t>
+      </w:r>
+      <w:proofErr w:type="spellStart"/>
+      <w:r>
+        <w:t>json</w:t>
+      </w:r>
+      <w:proofErr w:type="spellEnd"/>
+      <w:r>
+        <w:t>' \</w:t>
+      </w:r>
+      <w:r>
+        <w:br/>
+      </w:r>
+      <w:r>
+        <w:lastRenderedPageBreak/>
+        <w:t>--data '{</w:t>
+      </w:r>
+      <w:r>
+        <w:br/>
+        <w:t>    "path": "550fdc81-ee6a-4983-8dc0-dd4187d08a53/InputFile.xlsx"</w:t>
       </w:r>
       <w:r>
         <w:br/>
@@ -1011,6 +1058,7 @@
     </w:p>
     <w:p>
       <w:r>
+        <w:lastRenderedPageBreak/>
         <w:t>}</w:t>
       </w:r>
     </w:p>
@@ -1020,7 +1068,6 @@
     <w:p/>
     <w:p>
       <w:r>
-        <w:lastRenderedPageBreak/>
         <w:t>Error Handling:</w:t>
       </w:r>
     </w:p>
@@ -26720,6 +26767,26 @@
 </file>
 
 <file path=customXml/item1.xml><?xml version="1.0" encoding="utf-8"?>
+<p:properties xmlns:p="http://schemas.microsoft.com/office/2006/metadata/properties" xmlns:xsi="http://www.w3.org/2001/XMLSchema-instance" xmlns:pc="http://schemas.microsoft.com/office/infopath/2007/PartnerControls">
+  <documentManagement>
+    <TaxCatchAll xmlns="06a0ce47-cb0d-4d15-a5f3-03143b0c9181" xsi:nil="true"/>
+    <lcf76f155ced4ddcb4097134ff3c332f xmlns="3be81794-9d4e-48c5-b23b-136500ae8397">
+      <Terms xmlns="http://schemas.microsoft.com/office/infopath/2007/PartnerControls"/>
+    </lcf76f155ced4ddcb4097134ff3c332f>
+  </documentManagement>
+</p:properties>
+</file>
+
+<file path=customXml/item2.xml><?xml version="1.0" encoding="utf-8"?>
+<?mso-contentType ?>
+<FormTemplates xmlns="http://schemas.microsoft.com/sharepoint/v3/contenttype/forms">
+  <Display>DocumentLibraryForm</Display>
+  <Edit>DocumentLibraryForm</Edit>
+  <New>DocumentLibraryForm</New>
+</FormTemplates>
+</file>
+
+<file path=customXml/item3.xml><?xml version="1.0" encoding="utf-8"?>
 <ct:contentTypeSchema xmlns:ct="http://schemas.microsoft.com/office/2006/metadata/contentType" xmlns:ma="http://schemas.microsoft.com/office/2006/metadata/properties/metaAttributes" ct:_="" ma:_="" ma:contentTypeName="Document" ma:contentTypeID="0x01010025A54D9840F4B243A06CC21EC0EEFDBE" ma:contentTypeVersion="11" ma:contentTypeDescription="Create a new document." ma:contentTypeScope="" ma:versionID="d602ce95f0c1677889600475dc5d400f">
   <xsd:schema xmlns:xsd="http://www.w3.org/2001/XMLSchema" xmlns:xs="http://www.w3.org/2001/XMLSchema" xmlns:p="http://schemas.microsoft.com/office/2006/metadata/properties" xmlns:ns2="3be81794-9d4e-48c5-b23b-136500ae8397" xmlns:ns3="06a0ce47-cb0d-4d15-a5f3-03143b0c9181" targetNamespace="http://schemas.microsoft.com/office/2006/metadata/properties" ma:root="true" ma:fieldsID="07499409654485141de872a43026600f" ns2:_="" ns3:_="">
     <xsd:import namespace="3be81794-9d4e-48c5-b23b-136500ae8397"/>
@@ -26914,34 +26981,40 @@
 </ct:contentTypeSchema>
 </file>
 
-<file path=customXml/item2.xml><?xml version="1.0" encoding="utf-8"?>
-<?mso-contentType ?>
-<FormTemplates xmlns="http://schemas.microsoft.com/sharepoint/v3/contenttype/forms">
-  <Display>DocumentLibraryForm</Display>
-  <Edit>DocumentLibraryForm</Edit>
-  <New>DocumentLibraryForm</New>
-</FormTemplates>
-</file>
-
-<file path=customXml/item3.xml><?xml version="1.0" encoding="utf-8"?>
-<p:properties xmlns:p="http://schemas.microsoft.com/office/2006/metadata/properties" xmlns:xsi="http://www.w3.org/2001/XMLSchema-instance" xmlns:pc="http://schemas.microsoft.com/office/infopath/2007/PartnerControls">
-  <documentManagement>
-    <TaxCatchAll xmlns="06a0ce47-cb0d-4d15-a5f3-03143b0c9181" xsi:nil="true"/>
-    <lcf76f155ced4ddcb4097134ff3c332f xmlns="3be81794-9d4e-48c5-b23b-136500ae8397">
-      <Terms xmlns="http://schemas.microsoft.com/office/infopath/2007/PartnerControls"/>
-    </lcf76f155ced4ddcb4097134ff3c332f>
-  </documentManagement>
-</p:properties>
-</file>
-
 <file path=customXml/itemProps1.xml><?xml version="1.0" encoding="utf-8"?>
-<ds:datastoreItem xmlns:ds="http://schemas.openxmlformats.org/officeDocument/2006/customXml" ds:itemID="{41FF410D-55D2-4DFD-871B-56B6FA7E176E}"/>
+<ds:datastoreItem xmlns:ds="http://schemas.openxmlformats.org/officeDocument/2006/customXml" ds:itemID="{9356F5D8-6C83-4530-81B2-A08C85419C27}">
+  <ds:schemaRefs>
+    <ds:schemaRef ds:uri="http://schemas.microsoft.com/office/2006/metadata/properties"/>
+    <ds:schemaRef ds:uri="http://schemas.microsoft.com/office/infopath/2007/PartnerControls"/>
+    <ds:schemaRef ds:uri="06a0ce47-cb0d-4d15-a5f3-03143b0c9181"/>
+    <ds:schemaRef ds:uri="3be81794-9d4e-48c5-b23b-136500ae8397"/>
+  </ds:schemaRefs>
+</ds:datastoreItem>
 </file>
 
 <file path=customXml/itemProps2.xml><?xml version="1.0" encoding="utf-8"?>
-<ds:datastoreItem xmlns:ds="http://schemas.openxmlformats.org/officeDocument/2006/customXml" ds:itemID="{16F6E992-B1F7-4FCF-93C2-5D82748ED5D7}"/>
+<ds:datastoreItem xmlns:ds="http://schemas.openxmlformats.org/officeDocument/2006/customXml" ds:itemID="{16F6E992-B1F7-4FCF-93C2-5D82748ED5D7}">
+  <ds:schemaRefs>
+    <ds:schemaRef ds:uri="http://schemas.microsoft.com/sharepoint/v3/contenttype/forms"/>
+  </ds:schemaRefs>
+</ds:datastoreItem>
 </file>
 
 <file path=customXml/itemProps3.xml><?xml version="1.0" encoding="utf-8"?>
-<ds:datastoreItem xmlns:ds="http://schemas.openxmlformats.org/officeDocument/2006/customXml" ds:itemID="{9356F5D8-6C83-4530-81B2-A08C85419C27}"/>
+<ds:datastoreItem xmlns:ds="http://schemas.openxmlformats.org/officeDocument/2006/customXml" ds:itemID="{41FF410D-55D2-4DFD-871B-56B6FA7E176E}">
+  <ds:schemaRefs>
+    <ds:schemaRef ds:uri="http://schemas.microsoft.com/office/2006/metadata/contentType"/>
+    <ds:schemaRef ds:uri="http://schemas.microsoft.com/office/2006/metadata/properties/metaAttributes"/>
+    <ds:schemaRef ds:uri="http://www.w3.org/2001/XMLSchema"/>
+    <ds:schemaRef ds:uri="http://schemas.microsoft.com/office/2006/metadata/properties"/>
+    <ds:schemaRef ds:uri="3be81794-9d4e-48c5-b23b-136500ae8397"/>
+    <ds:schemaRef ds:uri="06a0ce47-cb0d-4d15-a5f3-03143b0c9181"/>
+    <ds:schemaRef ds:uri="http://schemas.microsoft.com/office/2006/documentManagement/types"/>
+    <ds:schemaRef ds:uri="http://schemas.microsoft.com/office/infopath/2007/PartnerControls"/>
+    <ds:schemaRef ds:uri="http://schemas.openxmlformats.org/package/2006/metadata/core-properties"/>
+    <ds:schemaRef ds:uri="http://purl.org/dc/elements/1.1/"/>
+    <ds:schemaRef ds:uri="http://purl.org/dc/terms/"/>
+    <ds:schemaRef ds:uri="http://schemas.microsoft.com/internal/obd"/>
+  </ds:schemaRefs>
+</ds:datastoreItem>
 </file>
</xml_diff>